<commit_message>
Manual v4: corrige teto da Gravidade (40→30) e explica máximo de 120
Correções:
- Tabela 3.1, seção 6 (intro e §6.4): Gravidade corrigida de 40 para
  30 pontos em todas as ocorrências (tabela, texto base legal, §6.4).
- §6.4: adicionada explicação explícita do cap — mesmo que SF2.1 +
  SF2.2 + SF2.3 superem 30, o valor adotado na Soma Total é 30.
- Tabela Dano (§7.4 e Table 24): Dano Imaterial teto corrigido de 30
  para 20 pontos (teto individual igual ao Dano Material).
- Soma Total na tabela 3.1: coluna Teto atualizada para "120 (teórico)".

Novo conteúdo em §3.1:
- Parágrafo explicando que o máximo de 120 pts é o teto teórico e seu
  vínculo direto com o princípio da proporcionalidade.
- Detalhamento da composição: 90 pts fixos (Nat 30 + Grav 30 + Dano 30)
  + 30 pts variáveis positivos (Circ agrav +15 + Maus ant +15) = 120.
- Nota sobre atenuantes/bons antecedentes como redutores variáveis.

https://claude.ai/code/session_01HyfJBH68rzsxSW5gUr86Cc
</commit_message>
<xml_diff>
--- a/Manual_Calculadora_Dosimetria_v4.docx
+++ b/Manual_Calculadora_Dosimetria_v4.docx
@@ -3914,6 +3914,30 @@
         <w:t xml:space="preserve">3.1 O sistema de pontos e os tetos por elemento</w:t>
       </w:r>
     </w:p>
+    <w:p>
+      <w:pPr>
+        <w:pStyle w:val="Normal"/>
+      </w:pPr>
+      <w:r>
+        <w:t xml:space="preserve">A pontuação máxima teórica do sistema é de 120 pontos, valor que traduz o patamar de maior reprovabilidade possível compatível com advertência ou suspensão (art. 129 e art. 130 da Lei nº 8.112/1990). Esse limite decorre diretamente do princípio da proporcionalidade: a ferramenta não fabrica reprovabilidade inexistente — limita-se a organizar, medir e comparar os elementos que o próprio ordenamento elenca no art. 128.</w:t>
+      </w:r>
+    </w:p>
+    <w:p>
+      <w:pPr>
+        <w:pStyle w:val="Normal"/>
+      </w:pPr>
+      <w:r>
+        <w:t xml:space="preserve">A composição do máximo de 120 pontos é a seguinte: Natureza (teto 30) + Gravidade (teto 30, operacionalmente capado mesmo que a soma dos subfatores exceda esse valor) + Dano Material + Imaterial (teto conjunto 30, sendo 20 pts o teto individual de cada dimensão) = 90 pontos fixos; acrescidos dos moduladores variáveis: Circunstâncias agravantes (teto +15) + Maus antecedentes (teto +15) = 30 pontos variáveis positivos. Total máximo: 90 + 30 = 120 pontos. Atenuantes e bons antecedentes reduzem a soma abaixo desse valor — não há teto negativo para moduladores, mas a Calculadora não permite resultado negativo.</w:t>
+      </w:r>
+    </w:p>
+    <w:p>
+      <w:pPr>
+        <w:pStyle w:val="Normal"/>
+      </w:pPr>
+      <w:r>
+        <w:t xml:space="preserve">A tabela a seguir apresenta os elementos, suas naturezas e seus tetos:</w:t>
+      </w:r>
+    </w:p>
     <w:tbl>
       <w:tblPr>
         <w:tblW w:type="dxa" w:w="9360"/>
@@ -4307,7 +4331,7 @@
                 <w:sz w:val="18"/>
                 <w:szCs w:val="18"/>
               </w:rPr>
-              <w:t xml:space="preserve">1 a 40</w:t>
+              <w:t>1 a 30</w:t>
             </w:r>
           </w:p>
         </w:tc>
@@ -4341,7 +4365,7 @@
                 <w:sz w:val="18"/>
                 <w:szCs w:val="18"/>
               </w:rPr>
-              <w:t xml:space="preserve">40</w:t>
+              <w:t>30</w:t>
             </w:r>
           </w:p>
         </w:tc>
@@ -4893,7 +4917,7 @@
                 <w:sz w:val="18"/>
                 <w:szCs w:val="18"/>
               </w:rPr>
-              <w:t xml:space="preserve">—</w:t>
+              <w:t>120 (teórico)</w:t>
             </w:r>
           </w:p>
         </w:tc>
@@ -9356,7 +9380,7 @@
           <w:sz w:val="20"/>
           <w:szCs w:val="20"/>
         </w:rPr>
-        <w:t xml:space="preserve"> Teto: 40 pontos.</w:t>
+        <w:t xml:space="preserve"> Teto: 30 pontos.</w:t>
       </w:r>
     </w:p>
     <w:p>
@@ -9627,7 +9651,7 @@
           <w:sz w:val="20"/>
           <w:szCs w:val="20"/>
         </w:rPr>
-        <w:t xml:space="preserve">A versão 3.0 organiza a Gravidade em três subfatores. O subfator relativo ao alcance geográfico da conduta foi removido por sobreposição com subfatores do Dano Imaterial (SF3B.1 e SF3B.3), evitando dupla contagem. Com essa arquitetura, o teto do elemento foi fixado em 40 pontos.</w:t>
+        <w:t>A versão 3.0 organiza a Gravidade em três subfatores. O subfator relativo ao alcance geográfico da conduta foi removido por sobreposição com subfatores do Dano Imaterial (SF3B.1 e SF3B.3), evitando dupla contagem. Com essa arquitetura, o teto do elemento foi fixado em 30 pontos — ou seja, mesmo que a soma dos três subfatores (SF2.1 + SF2.2 + SF2.3) exceda 30, o valor máximo adotado para o elemento Gravidade na composição da Soma Total é sempre 30 pontos.</w:t>
       </w:r>
     </w:p>
     <w:p>
@@ -10353,7 +10377,7 @@
                 <w:sz w:val="18"/>
                 <w:szCs w:val="18"/>
               </w:rPr>
-              <w:t xml:space="preserve">A pontuação máxima de 40 pontos pressupõe a cumulação de alta proteção normativa, conduta continuada por período extenso e concurso formal de dispositivos. Esse conjunto é incomum — recomenda-se fundamentação detalhada quando a pontuação se aproximar do teto.</w:t>
+              <w:t>A pontuação máxima de 30 pontos pressupõe a cumulação de alta proteção normativa, conduta continuada por período extenso e concurso formal de dispositivos. Esse conjunto é incomum — recomenda-se fundamentação detalhada quando a pontuação se aproximar do teto.</w:t>
             </w:r>
           </w:p>
         </w:tc>
@@ -10767,7 +10791,7 @@
           <w:sz w:val="20"/>
           <w:szCs w:val="20"/>
         </w:rPr>
-        <w:t xml:space="preserve">O elemento compõe-se de duas dimensões avaliadas independentemente. O Dano Material (SF3A) tem teto de 20 pontos. O Dano Imaterial (SF3B) tem teto de 30 pontos. A pontuação final do elemento corresponde à soma das duas dimensões, limitada ao teto conjunto de 30 pontos.</w:t>
+        <w:t>O elemento compõe-se de duas dimensões avaliadas independentemente. O Dano Material (SF3A) tem teto de 20 pontos. O Dano Imaterial (SF3B) tem teto de 20 pontos. A pontuação final do elemento corresponde à soma das duas dimensões, limitada ao teto conjunto de 30 pontos.</w:t>
       </w:r>
     </w:p>
     <w:p>
@@ -11163,7 +11187,7 @@
                 <w:sz w:val="17"/>
                 <w:szCs w:val="17"/>
               </w:rPr>
-              <w:t xml:space="preserve">30</w:t>
+              <w:t>20</w:t>
             </w:r>
           </w:p>
         </w:tc>

</xml_diff>